<commit_message>
adding module 3 and files
</commit_message>
<xml_diff>
--- a/module-2/Ramirez_mod_2_csd420.docx
+++ b/module-2/Ramirez_mod_2_csd420.docx
@@ -9,32 +9,17 @@
     </w:p>
     <w:p>
       <w:r>
-        <w:t>3/</w:t>
-      </w:r>
-      <w:r>
-        <w:t>28</w:t>
-      </w:r>
-      <w:r>
-        <w:t>/2026</w:t>
+        <w:t>3/28/2026</w:t>
       </w:r>
     </w:p>
     <w:p>
       <w:r>
-        <w:t xml:space="preserve">Module </w:t>
-      </w:r>
-      <w:r>
-        <w:t>2</w:t>
-      </w:r>
-      <w:r>
-        <w:t xml:space="preserve"> </w:t>
+        <w:t xml:space="preserve">Module 2 </w:t>
       </w:r>
     </w:p>
     <w:p>
       <w:r>
-        <w:t xml:space="preserve">Assignment </w:t>
-      </w:r>
-      <w:r>
-        <w:t>2.2</w:t>
+        <w:t>Assignment 2.2</w:t>
       </w:r>
     </w:p>
     <w:p>
@@ -83,6 +68,17 @@
     <w:p>
       <w:r>
         <w:t xml:space="preserve">GitHub: </w:t>
+      </w:r>
+      <w:hyperlink r:id="rId5" w:history="1">
+        <w:r>
+          <w:rPr>
+            <w:rStyle w:val="Hyperlink"/>
+          </w:rPr>
+          <w:t>https://github.com/MrDangos/csd-430/tree/main/module-2</w:t>
+        </w:r>
+      </w:hyperlink>
+      <w:r>
+        <w:t xml:space="preserve"> </w:t>
       </w:r>
     </w:p>
     <w:sectPr>
@@ -1012,6 +1008,29 @@
       <w:spacing w:val="5"/>
     </w:rPr>
   </w:style>
+  <w:style w:type="character" w:styleId="Hyperlink">
+    <w:name w:val="Hyperlink"/>
+    <w:basedOn w:val="DefaultParagraphFont"/>
+    <w:uiPriority w:val="99"/>
+    <w:unhideWhenUsed/>
+    <w:rsid w:val="00F022F7"/>
+    <w:rPr>
+      <w:color w:val="467886" w:themeColor="hyperlink"/>
+      <w:u w:val="single"/>
+    </w:rPr>
+  </w:style>
+  <w:style w:type="character" w:styleId="UnresolvedMention">
+    <w:name w:val="Unresolved Mention"/>
+    <w:basedOn w:val="DefaultParagraphFont"/>
+    <w:uiPriority w:val="99"/>
+    <w:semiHidden/>
+    <w:unhideWhenUsed/>
+    <w:rsid w:val="00F022F7"/>
+    <w:rPr>
+      <w:color w:val="605E5C"/>
+      <w:shd w:val="clear" w:color="auto" w:fill="E1DFDD"/>
+    </w:rPr>
+  </w:style>
 </w:styles>
 </file>
 

</xml_diff>